<commit_message>
Document mixed-PDF OCR and SRS field coverage
Update setup instructions, test evidence, and the report and blog copies with the implemented OCR flow and verified results.

Co-authored-by: Saira Sani <saira2sani@gmail.com>
Co-authored-by: Alaiha Rizwan <alaiharizwan78@gmail.com>
Co-authored-by: Ghazeer Ahmed <159106696+ghazeer-ahmed@users.noreply.github.com>
Co-authored-by: Mohsin Meo <mohsinmeo0554@gmail.com>
Co-authored-by: Zohaib Khan <zebekhan73@gmail.com>
</commit_message>
<xml_diff>
--- a/documentation/AssureX_Claim_Engine_Project_Report.docx
+++ b/documentation/AssureX_Claim_Engine_Project_Report.docx
@@ -2869,28 +2869,22 @@
     </w:p>
     <w:p>
       <w:r>
-        <w:t xml:space="preserve">Evidence formats include PDF, JPG/JPEG, PNG, and MP4, subject to configured validation and size limits. Text-based PDF extraction uses </w:t>
+        <w:t>Evidence formats include PDF, JPG/JPEG, PNG, and MP4, subject to configured validation and size limits. Text-based PDF extraction uses pypdf. Image and scanned-PDF OCR use pytesseract and a locally installed Tesseract executable. Text is extracted page by page; the first five pages without selectable text are rendered with PyMuPDF and passed to OCR, including mixed text/scanned PDFs. Extracted fields are shown for user verification rather than being accepted silently. Broad receipt-layout accuracy is not established.</w:t>
       </w:r>
       <w:r>
         <w:rPr>
           <w:rFonts w:ascii="Consolas" w:hAnsi="Consolas"/>
           <w:sz w:val="18"/>
         </w:rPr>
-        <w:t>pypdf</w:t>
       </w:r>
-      <w:r>
-        <w:t xml:space="preserve">. Image and scanned-PDF OCR use </w:t>
-      </w:r>
+      <w:r/>
       <w:r>
         <w:rPr>
           <w:rFonts w:ascii="Consolas" w:hAnsi="Consolas"/>
           <w:sz w:val="18"/>
         </w:rPr>
-        <w:t>pytesseract</w:t>
       </w:r>
-      <w:r>
-        <w:t xml:space="preserve"> and a locally installed Tesseract executable. Scanned PDFs are rendered with PyMuPDF, with OCR applied to the first five pages. Extracted fields are shown for user verification rather than being accepted silently. Broad receipt-layout accuracy is not established.</w:t>
-      </w:r>
+      <w:r/>
     </w:p>
     <w:p>
       <w:r>
@@ -2934,11 +2928,9 @@
           <w:rFonts w:ascii="Consolas" w:hAnsi="Consolas"/>
           <w:sz w:val="18"/>
         </w:rPr>
-        <w:t>documentation/TEST_RESULTS.md</w:t>
+        <w:t>documentation/TEST_RESULTS.md records 37 passing automated tests from 2026-09-28. The documented coverage includes accounts and roles, CSRF, claim and warranty dates, documents, PDF text extraction, Tesseract image, scanned-PDF, and mixed-PDF OCR, verification, duplicate and contradiction checks, repairs, notifications, policy snapshots, filters, reviewer transitions, overrides, evaluation history, and confidence consistency logic.</w:t>
       </w:r>
-      <w:r>
-        <w:t xml:space="preserve"> records 36 passing automated tests from 2026-09-28. The documented coverage includes accounts and roles, CSRF, claim and warranty dates, documents, PDF text extraction, Tesseract image OCR, verification, duplicate and contradiction checks, repairs, notifications, policy snapshots, filters, reviewer transitions, overrides, evaluation history, and confidence consistency logic.</w:t>
-      </w:r>
+      <w:r/>
     </w:p>
     <w:p>
       <w:r>

</xml_diff>